<commit_message>
Simplifica numeração de histórias para sequencial simples
EN-04 passa a numerar histórias apenas como 'História 1, 2…' dentro do
documento (separação visual, sem esquema de identificação); referências
por número + título. Documento do Pacote 2 reemitido no novo padrão.

Co-Authored-By: Claude Fable 5 <noreply@anthropic.com>
Claude-Session: https://claude.ai/code/session_017GrziW5UYuREHfRcnVVMio
</commit_message>
<xml_diff>
--- a/especificacoes/pacote2-parametrizacao-atas.docx
+++ b/especificacoes/pacote2-parametrizacao-atas.docx
@@ -499,7 +499,7 @@
         <w:jc w:val="both"/>
       </w:pPr>
       <w:r>
-        <w:t>O administrador acessa a pesquisa de atas para parametrização.</w:t>
+        <w:t>1. O administrador acessa a pesquisa de atas para parametrização.</w:t>
       </w:r>
     </w:p>
     <w:p>
@@ -509,7 +509,7 @@
         <w:jc w:val="both"/>
       </w:pPr>
       <w:r>
-        <w:t>Filtra por status e/ou busca por contrato, fornecedor ou nome da ata.</w:t>
+        <w:t>2. Filtra por status e/ou busca por contrato, fornecedor ou nome da ata.</w:t>
       </w:r>
     </w:p>
     <w:p>
@@ -519,7 +519,7 @@
         <w:jc w:val="both"/>
       </w:pPr>
       <w:r>
-        <w:t>Aciona "Parametrizar" (ata não parametrizada) ou "Editar" (ata já parametrizada).</w:t>
+        <w:t>3. Aciona "Parametrizar" (ata não parametrizada) ou "Editar" (ata já parametrizada).</w:t>
       </w:r>
     </w:p>
     <w:p>
@@ -529,7 +529,7 @@
         <w:jc w:val="both"/>
       </w:pPr>
       <w:r>
-        <w:t>A parametrização abre com os dados do Protheus em leitura e os campos parametrizáveis.</w:t>
+        <w:t>4. A parametrização abre com os dados do Protheus em leitura e os campos parametrizáveis.</w:t>
       </w:r>
     </w:p>
     <w:p>
@@ -539,7 +539,7 @@
         <w:jc w:val="both"/>
       </w:pPr>
       <w:r>
-        <w:t>O administrador define nome, pedido mínimo, aprovação do gestor (com gatilhos), imagens e autorizadores do consumo.</w:t>
+        <w:t>5. O administrador define nome, pedido mínimo, aprovação do gestor (com gatilhos), imagens e autorizadores do consumo.</w:t>
       </w:r>
     </w:p>
     <w:p>
@@ -549,7 +549,7 @@
         <w:jc w:val="both"/>
       </w:pPr>
       <w:r>
-        <w:t>Ao salvar, as validações são aplicadas e os parâmetros ficam disponíveis para os pacotes consumidores.</w:t>
+        <w:t>6. Ao salvar, as validações são aplicadas e os parâmetros ficam disponíveis para os pacotes consumidores.</w:t>
       </w:r>
     </w:p>
     <w:p>
@@ -582,7 +582,7 @@
         <w:jc w:val="left"/>
       </w:pPr>
       <w:r>
-        <w:t>HIST.M16.D02.01 — Parametrizar a ata de registro de preços</w:t>
+        <w:t>História 1 — Parametrizar a ata de registro de preços</w:t>
       </w:r>
     </w:p>
     <w:p>
@@ -718,7 +718,7 @@
         <w:jc w:val="left"/>
       </w:pPr>
       <w:r>
-        <w:t>HIST.M16.D02.02 — Pesquisar atas para parametrização</w:t>
+        <w:t>História 2 — Pesquisar atas para parametrização</w:t>
       </w:r>
     </w:p>
     <w:p>
@@ -4167,7 +4167,7 @@
                 <w:rFonts w:ascii="Calibri" w:hAnsi="Calibri"/>
                 <w:sz w:val="19"/>
               </w:rPr>
-              <w:t>Pacote 2 · HIST.M16.D02.01</w:t>
+              <w:t>Pacote 2 · História 1 — Parametrizar a ata</w:t>
             </w:r>
           </w:p>
         </w:tc>
@@ -5719,7 +5719,7 @@
                 <w:rFonts w:ascii="Calibri" w:hAnsi="Calibri"/>
                 <w:sz w:val="19"/>
               </w:rPr>
-              <w:t>Pacote 2 · HIST.M16.D02.02</w:t>
+              <w:t>Pacote 2 · História 2 — Pesquisar atas</w:t>
             </w:r>
           </w:p>
         </w:tc>
@@ -5800,7 +5800,7 @@
         <w:jc w:val="both"/>
       </w:pPr>
       <w:r>
-        <w:t>•  Tela de pesquisa de atas — busca, filtro por status com contagem e lista com ação por linha (funcionalidade 6.2 · HIST.M16.D02.02).</w:t>
+        <w:t>•  Tela de pesquisa de atas — busca, filtro por status com contagem e lista com ação por linha (funcionalidade 6.2 · História 2).</w:t>
       </w:r>
     </w:p>
     <w:p>
@@ -5810,7 +5810,7 @@
         <w:jc w:val="both"/>
       </w:pPr>
       <w:r>
-        <w:t>•  Tela de parametrização — dados do Protheus em leitura e parâmetros editáveis, incluindo autorizadores de origem Protheus e inclusão manual (funcionalidade 6.1 · HIST.M16.D02.01).</w:t>
+        <w:t>•  Tela de parametrização — dados do Protheus em leitura e parâmetros editáveis, incluindo autorizadores de origem Protheus e inclusão manual (funcionalidade 6.1 · História 1).</w:t>
       </w:r>
     </w:p>
     <w:p>

</xml_diff>